<commit_message>
Template AI done bugs fixed
</commit_message>
<xml_diff>
--- a/User_guide.docx
+++ b/User_guide.docx
@@ -37,16 +37,16 @@
         <mc:AlternateContent>
           <mc:Choice Requires="wps">
             <w:drawing>
-              <wp:anchor distT="0" distB="0" distL="114300" distR="114300" simplePos="0" relativeHeight="251667456" behindDoc="0" locked="0" layoutInCell="1" allowOverlap="1" wp14:anchorId="573BA656" wp14:editId="66DFF2A9">
+              <wp:anchor distT="0" distB="0" distL="114300" distR="114300" simplePos="0" relativeHeight="251667456" behindDoc="0" locked="0" layoutInCell="1" allowOverlap="1" wp14:anchorId="573BA656" wp14:editId="1AA5A593">
                 <wp:simplePos x="0" y="0"/>
                 <wp:positionH relativeFrom="column">
-                  <wp:posOffset>-137795</wp:posOffset>
+                  <wp:posOffset>-123418</wp:posOffset>
                 </wp:positionH>
                 <wp:positionV relativeFrom="paragraph">
-                  <wp:posOffset>175260</wp:posOffset>
+                  <wp:posOffset>104955</wp:posOffset>
                 </wp:positionV>
-                <wp:extent cx="1571625" cy="1419225"/>
-                <wp:effectExtent l="19050" t="19050" r="28575" b="28575"/>
+                <wp:extent cx="1246913" cy="1154142"/>
+                <wp:effectExtent l="19050" t="19050" r="10795" b="27305"/>
                 <wp:wrapNone/>
                 <wp:docPr id="1283153901" name="Ellipszis 8"/>
                 <wp:cNvGraphicFramePr/>
@@ -57,7 +57,7 @@
                       <wps:spPr>
                         <a:xfrm>
                           <a:off x="0" y="0"/>
-                          <a:ext cx="1571625" cy="1419225"/>
+                          <a:ext cx="1246913" cy="1154142"/>
                         </a:xfrm>
                         <a:prstGeom prst="ellipse">
                           <a:avLst/>
@@ -94,6 +94,9 @@
                     </wps:wsp>
                   </a:graphicData>
                 </a:graphic>
+                <wp14:sizeRelH relativeFrom="margin">
+                  <wp14:pctWidth>0</wp14:pctWidth>
+                </wp14:sizeRelH>
                 <wp14:sizeRelV relativeFrom="margin">
                   <wp14:pctHeight>0</wp14:pctHeight>
                 </wp14:sizeRelV>
@@ -102,7 +105,7 @@
           </mc:Choice>
           <mc:Fallback>
             <w:pict>
-              <v:oval w14:anchorId="04A329E6" id="Ellipszis 8" o:spid="_x0000_s1026" style="position:absolute;margin-left:-10.85pt;margin-top:13.8pt;width:123.75pt;height:111.75pt;z-index:251667456;visibility:visible;mso-wrap-style:square;mso-height-percent:0;mso-wrap-distance-left:9pt;mso-wrap-distance-top:0;mso-wrap-distance-right:9pt;mso-wrap-distance-bottom:0;mso-position-horizontal:absolute;mso-position-horizontal-relative:text;mso-position-vertical:absolute;mso-position-vertical-relative:text;mso-height-percent:0;mso-height-relative:margin;v-text-anchor:middle" o:gfxdata="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" filled="f" strokecolor="red" strokeweight="2.25pt">
+              <v:oval w14:anchorId="1384CC2A" id="Ellipszis 8" o:spid="_x0000_s1026" style="position:absolute;margin-left:-9.7pt;margin-top:8.25pt;width:98.2pt;height:90.9pt;z-index:251667456;visibility:visible;mso-wrap-style:square;mso-width-percent:0;mso-height-percent:0;mso-wrap-distance-left:9pt;mso-wrap-distance-top:0;mso-wrap-distance-right:9pt;mso-wrap-distance-bottom:0;mso-position-horizontal:absolute;mso-position-horizontal-relative:text;mso-position-vertical:absolute;mso-position-vertical-relative:text;mso-width-percent:0;mso-height-percent:0;mso-width-relative:margin;mso-height-relative:margin;v-text-anchor:middle" o:gfxdata="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" filled="f" strokecolor="red" strokeweight="2.25pt">
                 <v:stroke joinstyle="miter"/>
               </v:oval>
             </w:pict>
@@ -110,6 +113,9 @@
         </mc:AlternateContent>
       </w:r>
       <w:r>
+        <w:rPr>
+          <w:noProof/>
+        </w:rPr>
         <w:drawing>
           <wp:inline distT="0" distB="0" distL="0" distR="0" wp14:anchorId="2C71015A" wp14:editId="44244D53">
             <wp:extent cx="5760720" cy="3425190"/>
@@ -239,6 +245,9 @@
         </mc:AlternateContent>
       </w:r>
       <w:r>
+        <w:rPr>
+          <w:noProof/>
+        </w:rPr>
         <w:drawing>
           <wp:inline distT="0" distB="0" distL="0" distR="0" wp14:anchorId="02EFAECD" wp14:editId="6EA46EAA">
             <wp:extent cx="5760720" cy="3425190"/>
@@ -292,16 +301,13 @@
     </w:p>
     <w:p>
       <w:r>
-        <w:t xml:space="preserve">Ez az oldal szolgál a felvett alkalmazottak </w:t>
-      </w:r>
-      <w:r>
-        <w:t xml:space="preserve">adatainak </w:t>
-      </w:r>
-      <w:r>
-        <w:t>kilistázására és a</w:t>
-      </w:r>
-      <w:r>
-        <w:t>z állományuk és munkaköreik szerkesztésére.</w:t>
+        <w:t>Ez az oldal szolgál a felvett alkalmazottak adatainak kilistázására és a</w:t>
+      </w:r>
+      <w:r>
+        <w:t xml:space="preserve"> pozíciójuk </w:t>
+      </w:r>
+      <w:r>
+        <w:t>és munkaköreik szerkesztésére.</w:t>
       </w:r>
     </w:p>
     <w:p>
@@ -318,6 +324,7 @@
     <w:p>
       <w:r>
         <w:rPr>
+          <w:noProof/>
           <w:u w:val="single"/>
         </w:rPr>
         <mc:AlternateContent>
@@ -393,6 +400,9 @@
         </mc:AlternateContent>
       </w:r>
       <w:r>
+        <w:rPr>
+          <w:noProof/>
+        </w:rPr>
         <w:drawing>
           <wp:inline distT="0" distB="0" distL="0" distR="0" wp14:anchorId="43645132" wp14:editId="4857E782">
             <wp:extent cx="5760720" cy="2927350"/>
@@ -446,7 +456,7 @@
                 <wp:positionV relativeFrom="paragraph">
                   <wp:posOffset>668020</wp:posOffset>
                 </wp:positionV>
-                <wp:extent cx="6209116" cy="838200"/>
+                <wp:extent cx="6209062" cy="838200"/>
                 <wp:effectExtent l="19050" t="19050" r="20320" b="19050"/>
                 <wp:wrapNone/>
                 <wp:docPr id="1139064314" name="Csoportba foglalás 4"/>
@@ -458,9 +468,9 @@
                       <wpg:grpSpPr>
                         <a:xfrm>
                           <a:off x="0" y="0"/>
-                          <a:ext cx="6209116" cy="838200"/>
+                          <a:ext cx="6209062" cy="838200"/>
                           <a:chOff x="0" y="0"/>
-                          <a:chExt cx="6209116" cy="838200"/>
+                          <a:chExt cx="6209062" cy="838200"/>
                         </a:xfrm>
                       </wpg:grpSpPr>
                       <wps:wsp>
@@ -544,8 +554,8 @@
                         </wps:cNvSpPr>
                         <wps:spPr bwMode="auto">
                           <a:xfrm>
-                            <a:off x="3923752" y="247650"/>
-                            <a:ext cx="2285364" cy="570864"/>
+                            <a:off x="3923698" y="247650"/>
+                            <a:ext cx="2285364" cy="386714"/>
                           </a:xfrm>
                           <a:prstGeom prst="rect">
                             <a:avLst/>
@@ -569,10 +579,10 @@
                                 <w:t xml:space="preserve">Itt lehet új </w:t>
                               </w:r>
                               <w:r>
-                                <w:t>munka állományt</w:t>
+                                <w:t xml:space="preserve">pozíciót </w:t>
                               </w:r>
                               <w:r>
-                                <w:t xml:space="preserve"> csiná</w:t>
+                                <w:t>csiná</w:t>
                               </w:r>
                               <w:r>
                                 <w:t>l</w:t>
@@ -598,7 +608,7 @@
           </mc:Choice>
           <mc:Fallback>
             <w:pict>
-              <v:group w14:anchorId="4D59F418" id="Csoportba foglalás 4" o:spid="_x0000_s1026" style="position:absolute;margin-left:100.5pt;margin-top:52.6pt;width:488.9pt;height:66pt;z-index:251660288;mso-position-horizontal-relative:page" coordsize="62091,8382" o:gfxdata="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">
+              <v:group w14:anchorId="4D59F418" id="Csoportba foglalás 4" o:spid="_x0000_s1026" style="position:absolute;margin-left:100.5pt;margin-top:52.6pt;width:488.9pt;height:66pt;z-index:251660288;mso-position-horizontal-relative:page" coordsize="62090,8382" o:gfxdata="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">
                 <v:oval id="Ellipszis 2" o:spid="_x0000_s1027" style="position:absolute;width:27432;height:8382;visibility:visible;mso-wrap-style:square;v-text-anchor:middle" o:gfxdata="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" filled="f" strokecolor="red" strokeweight="2.25pt">
                   <v:stroke joinstyle="miter"/>
                 </v:oval>
@@ -609,7 +619,7 @@
                   <v:stroke joinstyle="miter"/>
                   <v:path gradientshapeok="t" o:connecttype="rect"/>
                 </v:shapetype>
-                <v:shape id="Szövegdoboz 2" o:spid="_x0000_s1029" type="#_x0000_t202" style="position:absolute;left:39237;top:2476;width:22854;height:5709;visibility:visible;mso-wrap-style:square;v-text-anchor:top" o:gfxdata="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">
+                <v:shape id="Szövegdoboz 2" o:spid="_x0000_s1029" type="#_x0000_t202" style="position:absolute;left:39236;top:2476;width:22854;height:3867;visibility:visible;mso-wrap-style:square;v-text-anchor:top" o:gfxdata="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">
                   <v:textbox style="mso-fit-shape-to-text:t">
                     <w:txbxContent>
                       <w:p>
@@ -617,10 +627,10 @@
                           <w:t xml:space="preserve">Itt lehet új </w:t>
                         </w:r>
                         <w:r>
-                          <w:t>munka állományt</w:t>
+                          <w:t xml:space="preserve">pozíciót </w:t>
                         </w:r>
                         <w:r>
-                          <w:t xml:space="preserve"> csiná</w:t>
+                          <w:t>csiná</w:t>
                         </w:r>
                         <w:r>
                           <w:t>l</w:t>
@@ -645,6 +655,9 @@
         <w:br/>
       </w:r>
       <w:r>
+        <w:rPr>
+          <w:noProof/>
+        </w:rPr>
         <w:drawing>
           <wp:inline distT="0" distB="0" distL="0" distR="0" wp14:anchorId="2CCD54FF" wp14:editId="1ED89200">
             <wp:extent cx="3979214" cy="3248025"/>
@@ -699,7 +712,7 @@
                 <wp:positionV relativeFrom="paragraph">
                   <wp:posOffset>1163955</wp:posOffset>
                 </wp:positionV>
-                <wp:extent cx="6123542" cy="1971675"/>
+                <wp:extent cx="6123317" cy="1971675"/>
                 <wp:effectExtent l="0" t="0" r="10795" b="28575"/>
                 <wp:wrapNone/>
                 <wp:docPr id="1219840947" name="Csoportba foglalás 7"/>
@@ -711,9 +724,9 @@
                       <wpg:grpSpPr>
                         <a:xfrm>
                           <a:off x="0" y="0"/>
-                          <a:ext cx="6123542" cy="1971675"/>
+                          <a:ext cx="6123317" cy="1971675"/>
                           <a:chOff x="0" y="0"/>
-                          <a:chExt cx="6123542" cy="1971675"/>
+                          <a:chExt cx="6123317" cy="1971675"/>
                         </a:xfrm>
                       </wpg:grpSpPr>
                       <wps:wsp>
@@ -723,8 +736,8 @@
                         </wps:cNvSpPr>
                         <wps:spPr bwMode="auto">
                           <a:xfrm>
-                            <a:off x="3838178" y="314325"/>
-                            <a:ext cx="2285364" cy="1490979"/>
+                            <a:off x="3837953" y="314325"/>
+                            <a:ext cx="2285364" cy="1306829"/>
                           </a:xfrm>
                           <a:prstGeom prst="rect">
                             <a:avLst/>
@@ -751,7 +764,7 @@
                                 <w:t xml:space="preserve">létező </w:t>
                               </w:r>
                               <w:r>
-                                <w:t>állományokat</w:t>
+                                <w:t>pozíciókat</w:t>
                               </w:r>
                               <w:r>
                                 <w:t>,</w:t>
@@ -760,16 +773,19 @@
                                 <w:t xml:space="preserve"> akkor a </w:t>
                               </w:r>
                               <w:r>
-                                <w:t xml:space="preserve">be tudjuk állítani a létrehozási, olvasási, frissítési és törlési jogokat a különböző </w:t>
+                                <w:t>be tudjuk állítani a létrehozási, olvasási, frissítési és törlési jogokat a különböző</w:t>
                               </w:r>
                               <w:r>
-                                <w:t>munka állományoknak</w:t>
+                                <w:t xml:space="preserve"> pozícióknak</w:t>
                               </w:r>
                               <w:r>
                                 <w:t>. Itt tudjuk a</w:t>
                               </w:r>
                               <w:r>
-                                <w:t xml:space="preserve">z adott állományt </w:t>
+                                <w:t xml:space="preserve">z </w:t>
+                              </w:r>
+                              <w:r>
+                                <w:t xml:space="preserve">adott pozíciót </w:t>
                               </w:r>
                               <w:r>
                                 <w:t>törölni is</w:t>
@@ -863,8 +879,8 @@
           </mc:Choice>
           <mc:Fallback>
             <w:pict>
-              <v:group w14:anchorId="134DA8D7" id="Csoportba foglalás 7" o:spid="_x0000_s1030" style="position:absolute;margin-left:26.65pt;margin-top:91.65pt;width:482.15pt;height:155.25pt;z-index:251666432" coordsize="61235,19716" o:gfxdata="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">
-                <v:shape id="Szövegdoboz 2" o:spid="_x0000_s1031" type="#_x0000_t202" style="position:absolute;left:38381;top:3143;width:22854;height:14910;visibility:visible;mso-wrap-style:square;v-text-anchor:top" o:gfxdata="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">
+              <v:group w14:anchorId="134DA8D7" id="Csoportba foglalás 7" o:spid="_x0000_s1030" style="position:absolute;margin-left:26.65pt;margin-top:91.65pt;width:482.15pt;height:155.25pt;z-index:251666432" coordsize="61233,19716" o:gfxdata="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">
+                <v:shape id="Szövegdoboz 2" o:spid="_x0000_s1031" type="#_x0000_t202" style="position:absolute;left:38379;top:3143;width:22854;height:13068;visibility:visible;mso-wrap-style:square;v-text-anchor:top" o:gfxdata="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">
                   <v:textbox style="mso-fit-shape-to-text:t">
                     <w:txbxContent>
                       <w:p>
@@ -875,7 +891,7 @@
                           <w:t xml:space="preserve">létező </w:t>
                         </w:r>
                         <w:r>
-                          <w:t>állományokat</w:t>
+                          <w:t>pozíciókat</w:t>
                         </w:r>
                         <w:r>
                           <w:t>,</w:t>
@@ -884,16 +900,19 @@
                           <w:t xml:space="preserve"> akkor a </w:t>
                         </w:r>
                         <w:r>
-                          <w:t xml:space="preserve">be tudjuk állítani a létrehozási, olvasási, frissítési és törlési jogokat a különböző </w:t>
+                          <w:t>be tudjuk állítani a létrehozási, olvasási, frissítési és törlési jogokat a különböző</w:t>
                         </w:r>
                         <w:r>
-                          <w:t>munka állományoknak</w:t>
+                          <w:t xml:space="preserve"> pozícióknak</w:t>
                         </w:r>
                         <w:r>
                           <w:t>. Itt tudjuk a</w:t>
                         </w:r>
                         <w:r>
-                          <w:t xml:space="preserve">z adott állományt </w:t>
+                          <w:t xml:space="preserve">z </w:t>
+                        </w:r>
+                        <w:r>
+                          <w:t xml:space="preserve">adott pozíciót </w:t>
                         </w:r>
                         <w:r>
                           <w:t>törölni is</w:t>
@@ -914,6 +933,9 @@
         </mc:AlternateContent>
       </w:r>
       <w:r>
+        <w:rPr>
+          <w:noProof/>
+        </w:rPr>
         <w:drawing>
           <wp:inline distT="0" distB="0" distL="0" distR="0" wp14:anchorId="7F974BA2" wp14:editId="4533F1E8">
             <wp:extent cx="3959238" cy="3500120"/>
@@ -962,6 +984,7 @@
     <w:p>
       <w:r>
         <w:rPr>
+          <w:noProof/>
           <w:u w:val="single"/>
         </w:rPr>
         <mc:AlternateContent>
@@ -1043,6 +1066,9 @@
         </mc:AlternateContent>
       </w:r>
       <w:r>
+        <w:rPr>
+          <w:noProof/>
+        </w:rPr>
         <w:drawing>
           <wp:inline distT="0" distB="0" distL="0" distR="0" wp14:anchorId="0AAAADA3" wp14:editId="18C2FAE2">
             <wp:extent cx="5760720" cy="2613025"/>
@@ -1219,13 +1245,7 @@
                           <w:txbxContent>
                             <w:p>
                               <w:r>
-                                <w:t xml:space="preserve">Itt lehet új </w:t>
-                              </w:r>
-                              <w:r>
-                                <w:t xml:space="preserve">munkakört </w:t>
-                              </w:r>
-                              <w:r>
-                                <w:t xml:space="preserve">csinálni </w:t>
+                                <w:t xml:space="preserve">Itt lehet új munkakört csinálni </w:t>
                               </w:r>
                             </w:p>
                           </w:txbxContent>
@@ -1257,13 +1277,7 @@
                     <w:txbxContent>
                       <w:p>
                         <w:r>
-                          <w:t xml:space="preserve">Itt lehet új </w:t>
-                        </w:r>
-                        <w:r>
-                          <w:t xml:space="preserve">munkakört </w:t>
-                        </w:r>
-                        <w:r>
-                          <w:t xml:space="preserve">csinálni </w:t>
+                          <w:t xml:space="preserve">Itt lehet új munkakört csinálni </w:t>
                         </w:r>
                       </w:p>
                     </w:txbxContent>
@@ -1276,6 +1290,9 @@
         </mc:AlternateContent>
       </w:r>
       <w:r>
+        <w:rPr>
+          <w:noProof/>
+        </w:rPr>
         <w:drawing>
           <wp:inline distT="0" distB="0" distL="0" distR="0" wp14:anchorId="0B9D7748" wp14:editId="32F5AE38">
             <wp:extent cx="4419783" cy="3648075"/>
@@ -1509,6 +1526,9 @@
         </mc:AlternateContent>
       </w:r>
       <w:r>
+        <w:rPr>
+          <w:noProof/>
+        </w:rPr>
         <w:drawing>
           <wp:inline distT="0" distB="0" distL="0" distR="0" wp14:anchorId="2F975973" wp14:editId="67C58D3C">
             <wp:extent cx="4419783" cy="3648075"/>
@@ -1687,7 +1707,10 @@
                           <w:txbxContent>
                             <w:p>
                               <w:r>
-                                <w:t>Állomány megadása</w:t>
+                                <w:t xml:space="preserve">Pozíció </w:t>
+                              </w:r>
+                              <w:r>
+                                <w:t>megadása</w:t>
                               </w:r>
                             </w:p>
                           </w:txbxContent>
@@ -1722,7 +1745,10 @@
                     <w:txbxContent>
                       <w:p>
                         <w:r>
-                          <w:t>Állomány megadása</w:t>
+                          <w:t xml:space="preserve">Pozíció </w:t>
+                        </w:r>
+                        <w:r>
+                          <w:t>megadása</w:t>
                         </w:r>
                       </w:p>
                     </w:txbxContent>
@@ -2107,6 +2133,9 @@
         </mc:AlternateContent>
       </w:r>
       <w:r>
+        <w:rPr>
+          <w:noProof/>
+        </w:rPr>
         <w:drawing>
           <wp:inline distT="0" distB="0" distL="0" distR="0" wp14:anchorId="46BD9E71" wp14:editId="5CFC1B8D">
             <wp:extent cx="4919903" cy="2924175"/>
@@ -2499,10 +2528,7 @@
                           <w:txbxContent>
                             <w:p>
                               <w:r>
-                                <w:t xml:space="preserve">Kampány </w:t>
-                              </w:r>
-                              <w:r>
-                                <w:t>törlése</w:t>
+                                <w:t>Kampány törlése</w:t>
                               </w:r>
                             </w:p>
                           </w:txbxContent>
@@ -2537,10 +2563,7 @@
                     <w:txbxContent>
                       <w:p>
                         <w:r>
-                          <w:t xml:space="preserve">Kampány </w:t>
-                        </w:r>
-                        <w:r>
-                          <w:t>törlése</w:t>
+                          <w:t>Kampány törlése</w:t>
                         </w:r>
                       </w:p>
                     </w:txbxContent>
@@ -2744,6 +2767,9 @@
         </mc:AlternateContent>
       </w:r>
       <w:r>
+        <w:rPr>
+          <w:noProof/>
+        </w:rPr>
         <w:drawing>
           <wp:inline distT="0" distB="0" distL="0" distR="0" wp14:anchorId="6311EA39" wp14:editId="2172D852">
             <wp:extent cx="5760720" cy="2228850"/>
@@ -2884,6 +2910,9 @@
     </w:p>
     <w:p>
       <w:r>
+        <w:rPr>
+          <w:noProof/>
+        </w:rPr>
         <w:drawing>
           <wp:inline distT="0" distB="0" distL="0" distR="0" wp14:anchorId="79634FDD" wp14:editId="1DADA25E">
             <wp:extent cx="5760720" cy="2228850"/>
@@ -3628,6 +3657,9 @@
         </mc:AlternateContent>
       </w:r>
       <w:r>
+        <w:rPr>
+          <w:noProof/>
+        </w:rPr>
         <w:drawing>
           <wp:inline distT="0" distB="0" distL="0" distR="0" wp14:anchorId="6F352708" wp14:editId="1D060881">
             <wp:extent cx="4682092" cy="2668772"/>
@@ -4054,6 +4086,9 @@
         </mc:AlternateContent>
       </w:r>
       <w:r>
+        <w:rPr>
+          <w:noProof/>
+        </w:rPr>
         <w:drawing>
           <wp:inline distT="0" distB="0" distL="0" distR="0" wp14:anchorId="480F7BA0" wp14:editId="05E89C67">
             <wp:extent cx="5760720" cy="2995930"/>
@@ -4182,6 +4217,9 @@
         </mc:AlternateContent>
       </w:r>
       <w:r>
+        <w:rPr>
+          <w:noProof/>
+        </w:rPr>
         <w:drawing>
           <wp:inline distT="0" distB="0" distL="0" distR="0" wp14:anchorId="52C07C67" wp14:editId="6935F457">
             <wp:extent cx="5760720" cy="3035935"/>
@@ -4317,6 +4355,9 @@
         </mc:AlternateContent>
       </w:r>
       <w:r>
+        <w:rPr>
+          <w:noProof/>
+        </w:rPr>
         <w:drawing>
           <wp:inline distT="0" distB="0" distL="0" distR="0" wp14:anchorId="46C4FCED" wp14:editId="09DF71CA">
             <wp:extent cx="5760720" cy="3035935"/>
@@ -4445,6 +4486,9 @@
         </mc:AlternateContent>
       </w:r>
       <w:r>
+        <w:rPr>
+          <w:noProof/>
+        </w:rPr>
         <w:drawing>
           <wp:inline distT="0" distB="0" distL="0" distR="0" wp14:anchorId="4201B730" wp14:editId="62F34159">
             <wp:extent cx="5760720" cy="3035935"/>
@@ -4484,6 +4528,9 @@
     </w:p>
     <w:p>
       <w:r>
+        <w:rPr>
+          <w:noProof/>
+        </w:rPr>
         <w:lastRenderedPageBreak/>
         <w:drawing>
           <wp:inline distT="0" distB="0" distL="0" distR="0" wp14:anchorId="30E33A50" wp14:editId="36F4D65A">
@@ -4683,6 +4730,9 @@
         </mc:AlternateContent>
       </w:r>
       <w:r>
+        <w:rPr>
+          <w:noProof/>
+        </w:rPr>
         <w:drawing>
           <wp:inline distT="0" distB="0" distL="0" distR="0" wp14:anchorId="1D3B2E80" wp14:editId="1C3008B8">
             <wp:extent cx="5760720" cy="3148330"/>
@@ -4825,6 +4875,9 @@
         </mc:AlternateContent>
       </w:r>
       <w:r>
+        <w:rPr>
+          <w:noProof/>
+        </w:rPr>
         <w:drawing>
           <wp:inline distT="0" distB="0" distL="0" distR="0" wp14:anchorId="071A2B4A" wp14:editId="3D7A632A">
             <wp:extent cx="5760720" cy="3035935"/>
@@ -5007,10 +5060,7 @@
                           <w:txbxContent>
                             <w:p>
                               <w:r>
-                                <w:t xml:space="preserve">Itt lehet beállítani, hogy automatikusan </w:t>
-                              </w:r>
-                              <w:r>
-                                <w:t>véletlenszerűen kiválasszon egy megadott számú embert értékelésre</w:t>
+                                <w:t>Itt lehet beállítani, hogy automatikusan véletlenszerűen kiválasszon egy megadott számú embert értékelésre</w:t>
                               </w:r>
                             </w:p>
                           </w:txbxContent>
@@ -5045,10 +5095,7 @@
                     <w:txbxContent>
                       <w:p>
                         <w:r>
-                          <w:t xml:space="preserve">Itt lehet beállítani, hogy automatikusan </w:t>
-                        </w:r>
-                        <w:r>
-                          <w:t>véletlenszerűen kiválasszon egy megadott számú embert értékelésre</w:t>
+                          <w:t>Itt lehet beállítani, hogy automatikusan véletlenszerűen kiválasszon egy megadott számú embert értékelésre</w:t>
                         </w:r>
                       </w:p>
                     </w:txbxContent>
@@ -5195,10 +5242,7 @@
                           <w:txbxContent>
                             <w:p>
                               <w:r>
-                                <w:t xml:space="preserve">Itt lehet </w:t>
-                              </w:r>
-                              <w:r>
-                                <w:t>beállítani, hogy automatikusan mindenkinek kelljen önértékelést kitöltenie</w:t>
+                                <w:t>Itt lehet beállítani, hogy automatikusan mindenkinek kelljen önértékelést kitöltenie</w:t>
                               </w:r>
                             </w:p>
                           </w:txbxContent>
@@ -5233,10 +5277,7 @@
                     <w:txbxContent>
                       <w:p>
                         <w:r>
-                          <w:t xml:space="preserve">Itt lehet </w:t>
-                        </w:r>
-                        <w:r>
-                          <w:t>beállítani, hogy automatikusan mindenkinek kelljen önértékelést kitöltenie</w:t>
+                          <w:t>Itt lehet beállítani, hogy automatikusan mindenkinek kelljen önértékelést kitöltenie</w:t>
                         </w:r>
                       </w:p>
                     </w:txbxContent>
@@ -5434,6 +5475,9 @@
         </mc:AlternateContent>
       </w:r>
       <w:r>
+        <w:rPr>
+          <w:noProof/>
+        </w:rPr>
         <w:drawing>
           <wp:inline distT="0" distB="0" distL="0" distR="0" wp14:anchorId="6748C911" wp14:editId="50D91730">
             <wp:extent cx="5727940" cy="2548909"/>
@@ -5662,6 +5706,9 @@
         </mc:AlternateContent>
       </w:r>
       <w:r>
+        <w:rPr>
+          <w:noProof/>
+        </w:rPr>
         <w:drawing>
           <wp:inline distT="0" distB="0" distL="0" distR="0" wp14:anchorId="295F0888" wp14:editId="3DD70174">
             <wp:extent cx="5727940" cy="2548909"/>
@@ -5842,10 +5889,7 @@
                           <w:txbxContent>
                             <w:p>
                               <w:r>
-                                <w:t xml:space="preserve">Ezzel a gombbal lehet </w:t>
-                              </w:r>
-                              <w:r>
-                                <w:t xml:space="preserve">törölni az </w:t>
+                                <w:t xml:space="preserve">Ezzel a gombbal lehet törölni az </w:t>
                               </w:r>
                               <w:proofErr w:type="spellStart"/>
                               <w:r>
@@ -5888,10 +5932,7 @@
                     <w:txbxContent>
                       <w:p>
                         <w:r>
-                          <w:t xml:space="preserve">Ezzel a gombbal lehet </w:t>
-                        </w:r>
-                        <w:r>
-                          <w:t xml:space="preserve">törölni az </w:t>
+                          <w:t xml:space="preserve">Ezzel a gombbal lehet törölni az </w:t>
                         </w:r>
                         <w:proofErr w:type="spellStart"/>
                         <w:r>
@@ -6097,6 +6138,9 @@
         </mc:AlternateContent>
       </w:r>
       <w:r>
+        <w:rPr>
+          <w:noProof/>
+        </w:rPr>
         <w:drawing>
           <wp:inline distT="0" distB="0" distL="0" distR="0" wp14:anchorId="79C8B975" wp14:editId="56F3163A">
             <wp:extent cx="5760720" cy="2771775"/>
@@ -6287,7 +6331,13 @@
                             <w:txbxContent>
                               <w:p>
                                 <w:r>
-                                  <w:t>Ha bepipálunk egy hozzárendelést, akkor megjelenik egy legördülő menü ahol ki lehet választani, hogy melyik sablont szeretnénk alkalmazni rá. Alapértelmezetten az értékelendő személy állományához legközelebbi nevű sablont választja ki.</w:t>
+                                  <w:t xml:space="preserve">Ha bepipálunk egy hozzárendelést, akkor megjelenik egy legördülő menü ahol ki lehet választani, hogy melyik sablont szeretnénk alkalmazni rá. Alapértelmezetten az értékelendő személy </w:t>
+                                </w:r>
+                                <w:r>
+                                  <w:t>pozíciójához</w:t>
+                                </w:r>
+                                <w:r>
+                                  <w:t xml:space="preserve"> legközelebbi nevű sablont választja ki.</w:t>
                                 </w:r>
                               </w:p>
                             </w:txbxContent>
@@ -6401,7 +6451,13 @@
                       <w:txbxContent>
                         <w:p>
                           <w:r>
-                            <w:t>Ha bepipálunk egy hozzárendelést, akkor megjelenik egy legördülő menü ahol ki lehet választani, hogy melyik sablont szeretnénk alkalmazni rá. Alapértelmezetten az értékelendő személy állományához legközelebbi nevű sablont választja ki.</w:t>
+                            <w:t xml:space="preserve">Ha bepipálunk egy hozzárendelést, akkor megjelenik egy legördülő menü ahol ki lehet választani, hogy melyik sablont szeretnénk alkalmazni rá. Alapértelmezetten az értékelendő személy </w:t>
+                          </w:r>
+                          <w:r>
+                            <w:t>pozíciójához</w:t>
+                          </w:r>
+                          <w:r>
+                            <w:t xml:space="preserve"> legközelebbi nevű sablont választja ki.</w:t>
                           </w:r>
                         </w:p>
                       </w:txbxContent>
@@ -6420,6 +6476,9 @@
         </mc:AlternateContent>
       </w:r>
       <w:r>
+        <w:rPr>
+          <w:noProof/>
+        </w:rPr>
         <w:drawing>
           <wp:inline distT="0" distB="0" distL="0" distR="0" wp14:anchorId="49562F99" wp14:editId="2570FB45">
             <wp:extent cx="5760720" cy="2744470"/>
@@ -6838,6 +6897,9 @@
         </mc:AlternateContent>
       </w:r>
       <w:r>
+        <w:rPr>
+          <w:noProof/>
+        </w:rPr>
         <w:drawing>
           <wp:inline distT="0" distB="0" distL="0" distR="0" wp14:anchorId="72D035C3" wp14:editId="73204C14">
             <wp:extent cx="5760720" cy="2744470"/>
@@ -6969,6 +7031,9 @@
         </mc:AlternateContent>
       </w:r>
       <w:r>
+        <w:rPr>
+          <w:noProof/>
+        </w:rPr>
         <w:drawing>
           <wp:inline distT="0" distB="0" distL="0" distR="0" wp14:anchorId="21774D73" wp14:editId="083F64A8">
             <wp:extent cx="5760720" cy="2744470"/>
@@ -7110,6 +7175,9 @@
         </mc:AlternateContent>
       </w:r>
       <w:r>
+        <w:rPr>
+          <w:noProof/>
+        </w:rPr>
         <w:drawing>
           <wp:inline distT="0" distB="0" distL="0" distR="0" wp14:anchorId="6E797211" wp14:editId="663367C5">
             <wp:extent cx="5760720" cy="2640330"/>
@@ -7178,6 +7246,9 @@
     </w:p>
     <w:p>
       <w:r>
+        <w:rPr>
+          <w:noProof/>
+        </w:rPr>
         <w:drawing>
           <wp:inline distT="0" distB="0" distL="0" distR="0" wp14:anchorId="751D8C94" wp14:editId="221FB0EE">
             <wp:extent cx="5760720" cy="2880360"/>
@@ -7318,6 +7389,9 @@
         </mc:AlternateContent>
       </w:r>
       <w:r>
+        <w:rPr>
+          <w:noProof/>
+        </w:rPr>
         <w:drawing>
           <wp:inline distT="0" distB="0" distL="0" distR="0" wp14:anchorId="2B662B86" wp14:editId="30EDAE63">
             <wp:extent cx="5760720" cy="1606550"/>
@@ -7373,6 +7447,9 @@
     </w:p>
     <w:p>
       <w:r>
+        <w:rPr>
+          <w:noProof/>
+        </w:rPr>
         <w:drawing>
           <wp:inline distT="0" distB="0" distL="0" distR="0" wp14:anchorId="766EA3B5" wp14:editId="68B9F747">
             <wp:extent cx="5760720" cy="1861185"/>
@@ -7430,6 +7507,9 @@
     </w:p>
     <w:p>
       <w:r>
+        <w:rPr>
+          <w:noProof/>
+        </w:rPr>
         <w:drawing>
           <wp:inline distT="0" distB="0" distL="0" distR="0" wp14:anchorId="46AD1CF2" wp14:editId="61E93876">
             <wp:extent cx="5760720" cy="2832735"/>
@@ -7635,6 +7715,9 @@
         </mc:AlternateContent>
       </w:r>
       <w:r>
+        <w:rPr>
+          <w:noProof/>
+        </w:rPr>
         <w:drawing>
           <wp:inline distT="0" distB="0" distL="0" distR="0" wp14:anchorId="5B263997" wp14:editId="1FE68CB2">
             <wp:extent cx="5760720" cy="2748915"/>

</xml_diff>